<commit_message>
hatırlatıcı düzenleme sistemi eklendi
</commit_message>
<xml_diff>
--- a/docs/hatırlatıcı form.docx
+++ b/docs/hatırlatıcı form.docx
@@ -224,498 +224,7 @@
     </w:p>
     <w:p>
       <w:pPr>
-        <w:rPr>
-          <w:b/>
-          <w:bCs/>
-          <w:sz w:val="32"/>
-          <w:szCs w:val="32"/>
-        </w:rPr>
-      </w:pPr>
-      <w:r>
-        <w:rPr>
-          <w:b/>
-          <w:bCs/>
-          <w:sz w:val="32"/>
-          <w:szCs w:val="32"/>
-        </w:rPr>
-        <w:t>Form Tasarımı İçin Kritik İpuçları (UI/UX)</w:t>
-      </w:r>
-    </w:p>
-    <w:tbl>
-      <w:tblPr>
-        <w:tblW w:w="0" w:type="auto"/>
-        <w:tblCellSpacing w:w="15" w:type="dxa"/>
-        <w:tblCellMar>
-          <w:left w:w="0" w:type="dxa"/>
-          <w:right w:w="0" w:type="dxa"/>
-        </w:tblCellMar>
-        <w:tblLook w:val="04A0" w:firstRow="1" w:lastRow="0" w:firstColumn="1" w:lastColumn="0" w:noHBand="0" w:noVBand="1"/>
-      </w:tblPr>
-      <w:tblGrid>
-        <w:gridCol w:w="1502"/>
-        <w:gridCol w:w="7554"/>
-      </w:tblGrid>
-      <w:tr>
-        <w:trPr>
-          <w:tblHeader/>
-          <w:tblCellSpacing w:w="15" w:type="dxa"/>
-        </w:trPr>
-        <w:tc>
-          <w:tcPr>
-            <w:tcW w:w="0" w:type="auto"/>
-            <w:tcBorders>
-              <w:top w:val="single" w:sz="6" w:space="0" w:color="auto"/>
-              <w:left w:val="single" w:sz="6" w:space="0" w:color="auto"/>
-              <w:bottom w:val="single" w:sz="6" w:space="0" w:color="auto"/>
-              <w:right w:val="single" w:sz="6" w:space="0" w:color="auto"/>
-            </w:tcBorders>
-            <w:tcMar>
-              <w:top w:w="240" w:type="dxa"/>
-              <w:left w:w="0" w:type="dxa"/>
-              <w:bottom w:w="240" w:type="dxa"/>
-              <w:right w:w="180" w:type="dxa"/>
-            </w:tcMar>
-            <w:vAlign w:val="center"/>
-            <w:hideMark/>
-          </w:tcPr>
-          <w:p>
-            <w:pPr>
-              <w:spacing w:after="0" w:line="240" w:lineRule="auto"/>
-              <w:rPr>
-                <w:rFonts w:ascii="Arial" w:eastAsia="Times New Roman" w:hAnsi="Arial" w:cs="Arial"/>
-                <w:color w:val="1F1F1F"/>
-                <w:kern w:val="0"/>
-                <w:lang w:eastAsia="tr-TR"/>
-                <w14:ligatures w14:val="none"/>
-              </w:rPr>
-            </w:pPr>
-            <w:r>
-              <w:rPr>
-                <w:rFonts w:ascii="Arial" w:eastAsia="Times New Roman" w:hAnsi="Arial" w:cs="Arial"/>
-                <w:b/>
-                <w:bCs/>
-                <w:color w:val="1F1F1F"/>
-                <w:kern w:val="0"/>
-                <w:bdr w:val="none" w:sz="0" w:space="0" w:color="auto" w:frame="1"/>
-                <w:lang w:eastAsia="tr-TR"/>
-                <w14:ligatures w14:val="none"/>
-              </w:rPr>
-              <w:t>Özellik</w:t>
-            </w:r>
-          </w:p>
-        </w:tc>
-        <w:tc>
-          <w:tcPr>
-            <w:tcW w:w="0" w:type="auto"/>
-            <w:tcBorders>
-              <w:top w:val="single" w:sz="6" w:space="0" w:color="auto"/>
-              <w:left w:val="single" w:sz="6" w:space="0" w:color="auto"/>
-              <w:bottom w:val="single" w:sz="6" w:space="0" w:color="auto"/>
-              <w:right w:val="single" w:sz="6" w:space="0" w:color="auto"/>
-            </w:tcBorders>
-            <w:tcMar>
-              <w:top w:w="240" w:type="dxa"/>
-              <w:left w:w="0" w:type="dxa"/>
-              <w:bottom w:w="240" w:type="dxa"/>
-              <w:right w:w="0" w:type="dxa"/>
-            </w:tcMar>
-            <w:vAlign w:val="center"/>
-            <w:hideMark/>
-          </w:tcPr>
-          <w:p>
-            <w:pPr>
-              <w:spacing w:after="0" w:line="240" w:lineRule="auto"/>
-              <w:rPr>
-                <w:rFonts w:ascii="Arial" w:eastAsia="Times New Roman" w:hAnsi="Arial" w:cs="Arial"/>
-                <w:color w:val="1F1F1F"/>
-                <w:kern w:val="0"/>
-                <w:lang w:eastAsia="tr-TR"/>
-                <w14:ligatures w14:val="none"/>
-              </w:rPr>
-            </w:pPr>
-            <w:r>
-              <w:rPr>
-                <w:rFonts w:ascii="Arial" w:eastAsia="Times New Roman" w:hAnsi="Arial" w:cs="Arial"/>
-                <w:b/>
-                <w:bCs/>
-                <w:color w:val="1F1F1F"/>
-                <w:kern w:val="0"/>
-                <w:bdr w:val="none" w:sz="0" w:space="0" w:color="auto" w:frame="1"/>
-                <w:lang w:eastAsia="tr-TR"/>
-                <w14:ligatures w14:val="none"/>
-              </w:rPr>
-              <w:t>Uygulama Yöntemi</w:t>
-            </w:r>
-          </w:p>
-        </w:tc>
-      </w:tr>
-      <w:tr>
-        <w:trPr>
-          <w:tblCellSpacing w:w="15" w:type="dxa"/>
-        </w:trPr>
-        <w:tc>
-          <w:tcPr>
-            <w:tcW w:w="0" w:type="auto"/>
-            <w:tcBorders>
-              <w:top w:val="single" w:sz="6" w:space="0" w:color="auto"/>
-              <w:left w:val="single" w:sz="6" w:space="0" w:color="auto"/>
-              <w:bottom w:val="single" w:sz="6" w:space="0" w:color="auto"/>
-              <w:right w:val="single" w:sz="6" w:space="0" w:color="auto"/>
-            </w:tcBorders>
-            <w:tcMar>
-              <w:top w:w="240" w:type="dxa"/>
-              <w:left w:w="0" w:type="dxa"/>
-              <w:bottom w:w="240" w:type="dxa"/>
-              <w:right w:w="180" w:type="dxa"/>
-            </w:tcMar>
-            <w:vAlign w:val="center"/>
-            <w:hideMark/>
-          </w:tcPr>
-          <w:p>
-            <w:pPr>
-              <w:spacing w:after="0" w:line="240" w:lineRule="auto"/>
-              <w:rPr>
-                <w:rFonts w:ascii="Arial" w:eastAsia="Times New Roman" w:hAnsi="Arial" w:cs="Arial"/>
-                <w:color w:val="1F1F1F"/>
-                <w:kern w:val="0"/>
-                <w:lang w:eastAsia="tr-TR"/>
-                <w14:ligatures w14:val="none"/>
-              </w:rPr>
-            </w:pPr>
-            <w:r>
-              <w:rPr>
-                <w:rFonts w:ascii="Arial" w:eastAsia="Times New Roman" w:hAnsi="Arial" w:cs="Arial"/>
-                <w:b/>
-                <w:bCs/>
-                <w:color w:val="1F1F1F"/>
-                <w:kern w:val="0"/>
-                <w:bdr w:val="none" w:sz="0" w:space="0" w:color="auto" w:frame="1"/>
-                <w:lang w:eastAsia="tr-TR"/>
-                <w14:ligatures w14:val="none"/>
-              </w:rPr>
-              <w:t>Butonlar</w:t>
-            </w:r>
-          </w:p>
-        </w:tc>
-        <w:tc>
-          <w:tcPr>
-            <w:tcW w:w="0" w:type="auto"/>
-            <w:tcBorders>
-              <w:top w:val="single" w:sz="6" w:space="0" w:color="auto"/>
-              <w:left w:val="single" w:sz="6" w:space="0" w:color="auto"/>
-              <w:bottom w:val="single" w:sz="6" w:space="0" w:color="auto"/>
-              <w:right w:val="single" w:sz="6" w:space="0" w:color="auto"/>
-            </w:tcBorders>
-            <w:tcMar>
-              <w:top w:w="240" w:type="dxa"/>
-              <w:left w:w="0" w:type="dxa"/>
-              <w:bottom w:w="240" w:type="dxa"/>
-              <w:right w:w="0" w:type="dxa"/>
-            </w:tcMar>
-            <w:vAlign w:val="center"/>
-            <w:hideMark/>
-          </w:tcPr>
-          <w:p>
-            <w:pPr>
-              <w:spacing w:after="0" w:line="240" w:lineRule="auto"/>
-              <w:rPr>
-                <w:rFonts w:ascii="Arial" w:eastAsia="Times New Roman" w:hAnsi="Arial" w:cs="Arial"/>
-                <w:color w:val="1F1F1F"/>
-                <w:kern w:val="0"/>
-                <w:lang w:eastAsia="tr-TR"/>
-                <w14:ligatures w14:val="none"/>
-              </w:rPr>
-            </w:pPr>
-            <w:r>
-              <w:rPr>
-                <w:rFonts w:ascii="Arial" w:eastAsia="Times New Roman" w:hAnsi="Arial" w:cs="Arial"/>
-                <w:color w:val="1F1F1F"/>
-                <w:kern w:val="0"/>
-                <w:bdr w:val="none" w:sz="0" w:space="0" w:color="auto" w:frame="1"/>
-                <w:lang w:eastAsia="tr-TR"/>
-                <w14:ligatures w14:val="none"/>
-              </w:rPr>
-              <w:t>Minimum 44x44 piksel, belirgin ve dokunması kolay.</w:t>
-            </w:r>
-          </w:p>
-        </w:tc>
-      </w:tr>
-      <w:tr>
-        <w:trPr>
-          <w:tblCellSpacing w:w="15" w:type="dxa"/>
-        </w:trPr>
-        <w:tc>
-          <w:tcPr>
-            <w:tcW w:w="0" w:type="auto"/>
-            <w:tcBorders>
-              <w:top w:val="single" w:sz="6" w:space="0" w:color="auto"/>
-              <w:left w:val="single" w:sz="6" w:space="0" w:color="auto"/>
-              <w:bottom w:val="single" w:sz="6" w:space="0" w:color="auto"/>
-              <w:right w:val="single" w:sz="6" w:space="0" w:color="auto"/>
-            </w:tcBorders>
-            <w:tcMar>
-              <w:top w:w="240" w:type="dxa"/>
-              <w:left w:w="0" w:type="dxa"/>
-              <w:bottom w:w="240" w:type="dxa"/>
-              <w:right w:w="180" w:type="dxa"/>
-            </w:tcMar>
-            <w:vAlign w:val="center"/>
-            <w:hideMark/>
-          </w:tcPr>
-          <w:p>
-            <w:pPr>
-              <w:spacing w:after="0" w:line="240" w:lineRule="auto"/>
-              <w:rPr>
-                <w:rFonts w:ascii="Arial" w:eastAsia="Times New Roman" w:hAnsi="Arial" w:cs="Arial"/>
-                <w:color w:val="1F1F1F"/>
-                <w:kern w:val="0"/>
-                <w:lang w:eastAsia="tr-TR"/>
-                <w14:ligatures w14:val="none"/>
-              </w:rPr>
-            </w:pPr>
-            <w:r>
-              <w:rPr>
-                <w:rFonts w:ascii="Arial" w:eastAsia="Times New Roman" w:hAnsi="Arial" w:cs="Arial"/>
-                <w:b/>
-                <w:bCs/>
-                <w:color w:val="1F1F1F"/>
-                <w:kern w:val="0"/>
-                <w:bdr w:val="none" w:sz="0" w:space="0" w:color="auto" w:frame="1"/>
-                <w:lang w:eastAsia="tr-TR"/>
-                <w14:ligatures w14:val="none"/>
-              </w:rPr>
-              <w:t>Kontrast</w:t>
-            </w:r>
-          </w:p>
-        </w:tc>
-        <w:tc>
-          <w:tcPr>
-            <w:tcW w:w="0" w:type="auto"/>
-            <w:tcBorders>
-              <w:top w:val="single" w:sz="6" w:space="0" w:color="auto"/>
-              <w:left w:val="single" w:sz="6" w:space="0" w:color="auto"/>
-              <w:bottom w:val="single" w:sz="6" w:space="0" w:color="auto"/>
-              <w:right w:val="single" w:sz="6" w:space="0" w:color="auto"/>
-            </w:tcBorders>
-            <w:tcMar>
-              <w:top w:w="240" w:type="dxa"/>
-              <w:left w:w="0" w:type="dxa"/>
-              <w:bottom w:w="240" w:type="dxa"/>
-              <w:right w:w="0" w:type="dxa"/>
-            </w:tcMar>
-            <w:vAlign w:val="center"/>
-            <w:hideMark/>
-          </w:tcPr>
-          <w:p>
-            <w:pPr>
-              <w:spacing w:after="0" w:line="240" w:lineRule="auto"/>
-              <w:rPr>
-                <w:rFonts w:ascii="Arial" w:eastAsia="Times New Roman" w:hAnsi="Arial" w:cs="Arial"/>
-                <w:color w:val="1F1F1F"/>
-                <w:kern w:val="0"/>
-                <w:lang w:eastAsia="tr-TR"/>
-                <w14:ligatures w14:val="none"/>
-              </w:rPr>
-            </w:pPr>
-            <w:r>
-              <w:rPr>
-                <w:rFonts w:ascii="Arial" w:eastAsia="Times New Roman" w:hAnsi="Arial" w:cs="Arial"/>
-                <w:color w:val="1F1F1F"/>
-                <w:kern w:val="0"/>
-                <w:bdr w:val="none" w:sz="0" w:space="0" w:color="auto" w:frame="1"/>
-                <w:lang w:eastAsia="tr-TR"/>
-                <w14:ligatures w14:val="none"/>
-              </w:rPr>
-              <w:t>Yüksek kontrastlı renkler (Beyaz üzerine siyah veya koyu mavi).</w:t>
-            </w:r>
-          </w:p>
-        </w:tc>
-      </w:tr>
-      <w:tr>
-        <w:trPr>
-          <w:tblCellSpacing w:w="15" w:type="dxa"/>
-        </w:trPr>
-        <w:tc>
-          <w:tcPr>
-            <w:tcW w:w="0" w:type="auto"/>
-            <w:tcBorders>
-              <w:top w:val="single" w:sz="6" w:space="0" w:color="auto"/>
-              <w:left w:val="single" w:sz="6" w:space="0" w:color="auto"/>
-              <w:bottom w:val="single" w:sz="6" w:space="0" w:color="auto"/>
-              <w:right w:val="single" w:sz="6" w:space="0" w:color="auto"/>
-            </w:tcBorders>
-            <w:tcMar>
-              <w:top w:w="240" w:type="dxa"/>
-              <w:left w:w="0" w:type="dxa"/>
-              <w:bottom w:w="240" w:type="dxa"/>
-              <w:right w:w="180" w:type="dxa"/>
-            </w:tcMar>
-            <w:vAlign w:val="center"/>
-            <w:hideMark/>
-          </w:tcPr>
-          <w:p>
-            <w:pPr>
-              <w:spacing w:after="0" w:line="240" w:lineRule="auto"/>
-              <w:rPr>
-                <w:rFonts w:ascii="Arial" w:eastAsia="Times New Roman" w:hAnsi="Arial" w:cs="Arial"/>
-                <w:color w:val="1F1F1F"/>
-                <w:kern w:val="0"/>
-                <w:lang w:eastAsia="tr-TR"/>
-                <w14:ligatures w14:val="none"/>
-              </w:rPr>
-            </w:pPr>
-            <w:r>
-              <w:rPr>
-                <w:rFonts w:ascii="Arial" w:eastAsia="Times New Roman" w:hAnsi="Arial" w:cs="Arial"/>
-                <w:b/>
-                <w:bCs/>
-                <w:color w:val="1F1F1F"/>
-                <w:kern w:val="0"/>
-                <w:bdr w:val="none" w:sz="0" w:space="0" w:color="auto" w:frame="1"/>
-                <w:lang w:eastAsia="tr-TR"/>
-                <w14:ligatures w14:val="none"/>
-              </w:rPr>
-              <w:t>Dil</w:t>
-            </w:r>
-          </w:p>
-        </w:tc>
-        <w:tc>
-          <w:tcPr>
-            <w:tcW w:w="0" w:type="auto"/>
-            <w:tcBorders>
-              <w:top w:val="single" w:sz="6" w:space="0" w:color="auto"/>
-              <w:left w:val="single" w:sz="6" w:space="0" w:color="auto"/>
-              <w:bottom w:val="single" w:sz="6" w:space="0" w:color="auto"/>
-              <w:right w:val="single" w:sz="6" w:space="0" w:color="auto"/>
-            </w:tcBorders>
-            <w:tcMar>
-              <w:top w:w="240" w:type="dxa"/>
-              <w:left w:w="0" w:type="dxa"/>
-              <w:bottom w:w="240" w:type="dxa"/>
-              <w:right w:w="0" w:type="dxa"/>
-            </w:tcMar>
-            <w:vAlign w:val="center"/>
-            <w:hideMark/>
-          </w:tcPr>
-          <w:p>
-            <w:pPr>
-              <w:spacing w:after="0" w:line="240" w:lineRule="auto"/>
-              <w:rPr>
-                <w:rFonts w:ascii="Arial" w:eastAsia="Times New Roman" w:hAnsi="Arial" w:cs="Arial"/>
-                <w:color w:val="1F1F1F"/>
-                <w:kern w:val="0"/>
-                <w:lang w:eastAsia="tr-TR"/>
-                <w14:ligatures w14:val="none"/>
-              </w:rPr>
-            </w:pPr>
-            <w:r>
-              <w:rPr>
-                <w:rFonts w:ascii="Arial" w:eastAsia="Times New Roman" w:hAnsi="Arial" w:cs="Arial"/>
-                <w:color w:val="1F1F1F"/>
-                <w:kern w:val="0"/>
-                <w:bdr w:val="none" w:sz="0" w:space="0" w:color="auto" w:frame="1"/>
-                <w:lang w:eastAsia="tr-TR"/>
-                <w14:ligatures w14:val="none"/>
-              </w:rPr>
-              <w:t>Emir kipi yerine rica veya yönlendirme ("İlacını içmeyi unutma" yerine "İlaç saati").</w:t>
-            </w:r>
-          </w:p>
-        </w:tc>
-      </w:tr>
-      <w:tr>
-        <w:trPr>
-          <w:tblCellSpacing w:w="15" w:type="dxa"/>
-        </w:trPr>
-        <w:tc>
-          <w:tcPr>
-            <w:tcW w:w="0" w:type="auto"/>
-            <w:tcBorders>
-              <w:top w:val="single" w:sz="6" w:space="0" w:color="auto"/>
-              <w:left w:val="single" w:sz="6" w:space="0" w:color="auto"/>
-              <w:bottom w:val="single" w:sz="6" w:space="0" w:color="auto"/>
-              <w:right w:val="single" w:sz="6" w:space="0" w:color="auto"/>
-            </w:tcBorders>
-            <w:tcMar>
-              <w:top w:w="240" w:type="dxa"/>
-              <w:left w:w="0" w:type="dxa"/>
-              <w:bottom w:w="240" w:type="dxa"/>
-              <w:right w:w="180" w:type="dxa"/>
-            </w:tcMar>
-            <w:vAlign w:val="center"/>
-            <w:hideMark/>
-          </w:tcPr>
-          <w:p>
-            <w:pPr>
-              <w:spacing w:after="0" w:line="240" w:lineRule="auto"/>
-              <w:rPr>
-                <w:rFonts w:ascii="Arial" w:eastAsia="Times New Roman" w:hAnsi="Arial" w:cs="Arial"/>
-                <w:color w:val="1F1F1F"/>
-                <w:kern w:val="0"/>
-                <w:lang w:eastAsia="tr-TR"/>
-                <w14:ligatures w14:val="none"/>
-              </w:rPr>
-            </w:pPr>
-            <w:r>
-              <w:rPr>
-                <w:rFonts w:ascii="Arial" w:eastAsia="Times New Roman" w:hAnsi="Arial" w:cs="Arial"/>
-                <w:b/>
-                <w:bCs/>
-                <w:color w:val="1F1F1F"/>
-                <w:kern w:val="0"/>
-                <w:bdr w:val="none" w:sz="0" w:space="0" w:color="auto" w:frame="1"/>
-                <w:lang w:eastAsia="tr-TR"/>
-                <w14:ligatures w14:val="none"/>
-              </w:rPr>
-              <w:t>Onay Süreci</w:t>
-            </w:r>
-          </w:p>
-        </w:tc>
-        <w:tc>
-          <w:tcPr>
-            <w:tcW w:w="0" w:type="auto"/>
-            <w:tcBorders>
-              <w:top w:val="single" w:sz="6" w:space="0" w:color="auto"/>
-              <w:left w:val="single" w:sz="6" w:space="0" w:color="auto"/>
-              <w:bottom w:val="single" w:sz="6" w:space="0" w:color="auto"/>
-              <w:right w:val="single" w:sz="6" w:space="0" w:color="auto"/>
-            </w:tcBorders>
-            <w:tcMar>
-              <w:top w:w="240" w:type="dxa"/>
-              <w:left w:w="0" w:type="dxa"/>
-              <w:bottom w:w="240" w:type="dxa"/>
-              <w:right w:w="0" w:type="dxa"/>
-            </w:tcMar>
-            <w:vAlign w:val="center"/>
-            <w:hideMark/>
-          </w:tcPr>
-          <w:p>
-            <w:pPr>
-              <w:spacing w:after="0" w:line="240" w:lineRule="auto"/>
-              <w:rPr>
-                <w:rFonts w:ascii="Arial" w:eastAsia="Times New Roman" w:hAnsi="Arial" w:cs="Arial"/>
-                <w:color w:val="1F1F1F"/>
-                <w:kern w:val="0"/>
-                <w:lang w:eastAsia="tr-TR"/>
-                <w14:ligatures w14:val="none"/>
-              </w:rPr>
-            </w:pPr>
-            <w:r>
-              <w:rPr>
-                <w:rFonts w:ascii="Arial" w:eastAsia="Times New Roman" w:hAnsi="Arial" w:cs="Arial"/>
-                <w:color w:val="1F1F1F"/>
-                <w:kern w:val="0"/>
-                <w:bdr w:val="none" w:sz="0" w:space="0" w:color="auto" w:frame="1"/>
-                <w:lang w:eastAsia="tr-TR"/>
-                <w14:ligatures w14:val="none"/>
-              </w:rPr>
-              <w:t>Formu doldurduktan sonra "Kaydet" butonu çok belirgin olmalı ve sesli bir onay ("Kaydedildi") vermelidir.</w:t>
-            </w:r>
-          </w:p>
-        </w:tc>
-      </w:tr>
-    </w:tbl>
-    <w:p>
-      <w:pPr>
+        <w:jc w:val="both"/>
         <w:rPr>
           <w:b/>
           <w:bCs/>

</xml_diff>